<commit_message>
(fix) making lower charts better and changing color palette
</commit_message>
<xml_diff>
--- a/templates/InformePlantilla.docx
+++ b/templates/InformePlantilla.docx
@@ -1597,6 +1597,7 @@
               <w:jc w:val="both"/>
               <w:rPr>
                 <w:rFonts w:ascii="Montserrat" w:hAnsi="Montserrat"/>
+                <w:color w:val="000000" w:themeColor="text1"/>
                 <w:sz w:val="20"/>
                 <w:szCs w:val="20"/>
               </w:rPr>
@@ -1604,90 +1605,12 @@
             <w:r>
               <w:rPr>
                 <w:rFonts w:ascii="Montserrat" w:hAnsi="Montserrat"/>
+                <w:color w:val="000000" w:themeColor="text1"/>
+                <w:spacing w:val="3"/>
                 <w:sz w:val="20"/>
                 <w:szCs w:val="20"/>
               </w:rPr>
-              <w:t>Porcentaje de estudiantes de una cohorte de</w:t>
-            </w:r>
-            <w:r>
-              <w:rPr>
-                <w:rFonts w:ascii="Montserrat" w:hAnsi="Montserrat"/>
-                <w:sz w:val="20"/>
-                <w:szCs w:val="20"/>
-              </w:rPr>
-              <w:t xml:space="preserve"> </w:t>
-            </w:r>
-            <w:r>
-              <w:rPr>
-                <w:rFonts w:ascii="Montserrat" w:hAnsi="Montserrat"/>
-                <w:sz w:val="20"/>
-                <w:szCs w:val="20"/>
-              </w:rPr>
-              <w:t>nuevo ingreso en el curso X, matriculados en el título T, en la</w:t>
-            </w:r>
-            <w:r>
-              <w:rPr>
-                <w:rFonts w:ascii="Montserrat" w:hAnsi="Montserrat"/>
-                <w:sz w:val="20"/>
-                <w:szCs w:val="20"/>
-              </w:rPr>
-              <w:t xml:space="preserve"> </w:t>
-            </w:r>
-            <w:r>
-              <w:rPr>
-                <w:rFonts w:ascii="Montserrat" w:hAnsi="Montserrat"/>
-                <w:sz w:val="20"/>
-                <w:szCs w:val="20"/>
-              </w:rPr>
-              <w:t>universidad U,</w:t>
-            </w:r>
-            <w:r>
-              <w:rPr>
-                <w:rFonts w:ascii="Montserrat" w:hAnsi="Montserrat"/>
-                <w:sz w:val="20"/>
-                <w:szCs w:val="20"/>
-              </w:rPr>
-              <w:t xml:space="preserve"> </w:t>
-            </w:r>
-            <w:r>
-              <w:rPr>
-                <w:rFonts w:ascii="Montserrat" w:hAnsi="Montserrat"/>
-                <w:sz w:val="20"/>
-                <w:szCs w:val="20"/>
-              </w:rPr>
-              <w:t>que sin haberse graduado en ese título no se han</w:t>
-            </w:r>
-            <w:r>
-              <w:rPr>
-                <w:rFonts w:ascii="Montserrat" w:hAnsi="Montserrat"/>
-                <w:sz w:val="20"/>
-                <w:szCs w:val="20"/>
-              </w:rPr>
-              <w:t xml:space="preserve"> </w:t>
-            </w:r>
-            <w:r>
-              <w:rPr>
-                <w:rFonts w:ascii="Montserrat" w:hAnsi="Montserrat"/>
-                <w:sz w:val="20"/>
-                <w:szCs w:val="20"/>
-              </w:rPr>
-              <w:t>matriculado en él durante dos</w:t>
-            </w:r>
-            <w:r>
-              <w:rPr>
-                <w:rFonts w:ascii="Montserrat" w:hAnsi="Montserrat"/>
-                <w:sz w:val="20"/>
-                <w:szCs w:val="20"/>
-              </w:rPr>
-              <w:t xml:space="preserve"> </w:t>
-            </w:r>
-            <w:r>
-              <w:rPr>
-                <w:rFonts w:ascii="Montserrat" w:hAnsi="Montserrat"/>
-                <w:sz w:val="20"/>
-                <w:szCs w:val="20"/>
-              </w:rPr>
-              <w:t>cursos seguidos.</w:t>
+              <w:t>Porcentaje de estudiantes de una cohorte de nuevo ingreso, que sin haberse graduado en el título no se ha matriculado en el durante dos cursos consecutivos</w:t>
             </w:r>
           </w:p>
         </w:tc>
@@ -2155,44 +2078,62 @@
     </w:p>
     <w:p>
       <w:pPr>
-        <w:jc w:val="left"/>
-        <w:rPr>
-          <w:lang w:val="en-US"/>
-        </w:rPr>
-      </w:pPr>
-      <w:proofErr w:type="gramStart"/>
-      <w:r>
+        <w:rPr>
+          <w:lang w:val="en-US"/>
+        </w:rPr>
+      </w:pPr>
+      <w:proofErr w:type="gramStart"/>
+      <w:r>
+        <w:rPr>
+          <w:lang w:val="en-US"/>
+        </w:rPr>
         <w:t>{{</w:t>
       </w:r>
       <w:r>
+        <w:rPr>
+          <w:lang w:val="en-US"/>
+        </w:rPr>
         <w:t xml:space="preserve"> </w:t>
       </w:r>
-      <w:proofErr w:type="spellStart"/>
-      <w:r>
+      <w:r>
+        <w:rPr>
+          <w:lang w:val="en-US"/>
+        </w:rPr>
         <w:t>degree</w:t>
       </w:r>
       <w:proofErr w:type="gramEnd"/>
       <w:r>
+        <w:rPr>
+          <w:lang w:val="en-US"/>
+        </w:rPr>
         <w:t>_</w:t>
       </w:r>
       <w:proofErr w:type="gramStart"/>
       <w:r>
+        <w:rPr>
+          <w:lang w:val="en-US"/>
+        </w:rPr>
         <w:t>data.resume</w:t>
       </w:r>
       <w:proofErr w:type="gramEnd"/>
       <w:r>
+        <w:rPr>
+          <w:lang w:val="en-US"/>
+        </w:rPr>
         <w:t>_</w:t>
       </w:r>
       <w:proofErr w:type="gramStart"/>
       <w:r>
-        <w:t>conclusion</w:t>
-      </w:r>
-      <w:proofErr w:type="spellEnd"/>
-      <w:r>
-        <w:t xml:space="preserve"> }</w:t>
-      </w:r>
-      <w:proofErr w:type="gramEnd"/>
-      <w:r>
+        <w:rPr>
+          <w:lang w:val="en-US"/>
+        </w:rPr>
+        <w:t>conclusion }</w:t>
+      </w:r>
+      <w:proofErr w:type="gramEnd"/>
+      <w:r>
+        <w:rPr>
+          <w:lang w:val="en-US"/>
+        </w:rPr>
         <w:t>}</w:t>
       </w:r>
     </w:p>
@@ -2315,7 +2256,6 @@
           <w:ilvl w:val="0"/>
           <w:numId w:val="18"/>
         </w:numPr>
-        <w:jc w:val="left"/>
         <w:rPr>
           <w:lang w:val="en-US"/>
         </w:rPr>
@@ -6769,7 +6709,6 @@
     </w:p>
     <w:p>
       <w:pPr>
-        <w:jc w:val="left"/>
         <w:rPr>
           <w:lang w:val="en-US"/>
         </w:rPr>
@@ -6944,7 +6883,6 @@
           <w:ilvl w:val="0"/>
           <w:numId w:val="18"/>
         </w:numPr>
-        <w:jc w:val="left"/>
         <w:rPr>
           <w:lang w:val="en-US"/>
         </w:rPr>
@@ -10198,6 +10136,7 @@
   <w:style w:type="character" w:default="1" w:styleId="Fuentedeprrafopredeter">
     <w:name w:val="Default Paragraph Font"/>
     <w:uiPriority w:val="1"/>
+    <w:semiHidden/>
     <w:unhideWhenUsed/>
   </w:style>
   <w:style w:type="table" w:default="1" w:styleId="Tablanormal">

</xml_diff>

<commit_message>
(fix) making lower charts better and changing color palette (#23)
</commit_message>
<xml_diff>
--- a/templates/InformePlantilla.docx
+++ b/templates/InformePlantilla.docx
@@ -1597,6 +1597,7 @@
               <w:jc w:val="both"/>
               <w:rPr>
                 <w:rFonts w:ascii="Montserrat" w:hAnsi="Montserrat"/>
+                <w:color w:val="000000" w:themeColor="text1"/>
                 <w:sz w:val="20"/>
                 <w:szCs w:val="20"/>
               </w:rPr>
@@ -1604,90 +1605,12 @@
             <w:r>
               <w:rPr>
                 <w:rFonts w:ascii="Montserrat" w:hAnsi="Montserrat"/>
+                <w:color w:val="000000" w:themeColor="text1"/>
+                <w:spacing w:val="3"/>
                 <w:sz w:val="20"/>
                 <w:szCs w:val="20"/>
               </w:rPr>
-              <w:t>Porcentaje de estudiantes de una cohorte de</w:t>
-            </w:r>
-            <w:r>
-              <w:rPr>
-                <w:rFonts w:ascii="Montserrat" w:hAnsi="Montserrat"/>
-                <w:sz w:val="20"/>
-                <w:szCs w:val="20"/>
-              </w:rPr>
-              <w:t xml:space="preserve"> </w:t>
-            </w:r>
-            <w:r>
-              <w:rPr>
-                <w:rFonts w:ascii="Montserrat" w:hAnsi="Montserrat"/>
-                <w:sz w:val="20"/>
-                <w:szCs w:val="20"/>
-              </w:rPr>
-              <w:t>nuevo ingreso en el curso X, matriculados en el título T, en la</w:t>
-            </w:r>
-            <w:r>
-              <w:rPr>
-                <w:rFonts w:ascii="Montserrat" w:hAnsi="Montserrat"/>
-                <w:sz w:val="20"/>
-                <w:szCs w:val="20"/>
-              </w:rPr>
-              <w:t xml:space="preserve"> </w:t>
-            </w:r>
-            <w:r>
-              <w:rPr>
-                <w:rFonts w:ascii="Montserrat" w:hAnsi="Montserrat"/>
-                <w:sz w:val="20"/>
-                <w:szCs w:val="20"/>
-              </w:rPr>
-              <w:t>universidad U,</w:t>
-            </w:r>
-            <w:r>
-              <w:rPr>
-                <w:rFonts w:ascii="Montserrat" w:hAnsi="Montserrat"/>
-                <w:sz w:val="20"/>
-                <w:szCs w:val="20"/>
-              </w:rPr>
-              <w:t xml:space="preserve"> </w:t>
-            </w:r>
-            <w:r>
-              <w:rPr>
-                <w:rFonts w:ascii="Montserrat" w:hAnsi="Montserrat"/>
-                <w:sz w:val="20"/>
-                <w:szCs w:val="20"/>
-              </w:rPr>
-              <w:t>que sin haberse graduado en ese título no se han</w:t>
-            </w:r>
-            <w:r>
-              <w:rPr>
-                <w:rFonts w:ascii="Montserrat" w:hAnsi="Montserrat"/>
-                <w:sz w:val="20"/>
-                <w:szCs w:val="20"/>
-              </w:rPr>
-              <w:t xml:space="preserve"> </w:t>
-            </w:r>
-            <w:r>
-              <w:rPr>
-                <w:rFonts w:ascii="Montserrat" w:hAnsi="Montserrat"/>
-                <w:sz w:val="20"/>
-                <w:szCs w:val="20"/>
-              </w:rPr>
-              <w:t>matriculado en él durante dos</w:t>
-            </w:r>
-            <w:r>
-              <w:rPr>
-                <w:rFonts w:ascii="Montserrat" w:hAnsi="Montserrat"/>
-                <w:sz w:val="20"/>
-                <w:szCs w:val="20"/>
-              </w:rPr>
-              <w:t xml:space="preserve"> </w:t>
-            </w:r>
-            <w:r>
-              <w:rPr>
-                <w:rFonts w:ascii="Montserrat" w:hAnsi="Montserrat"/>
-                <w:sz w:val="20"/>
-                <w:szCs w:val="20"/>
-              </w:rPr>
-              <w:t>cursos seguidos.</w:t>
+              <w:t>Porcentaje de estudiantes de una cohorte de nuevo ingreso, que sin haberse graduado en el título no se ha matriculado en el durante dos cursos consecutivos</w:t>
             </w:r>
           </w:p>
         </w:tc>
@@ -2155,44 +2078,62 @@
     </w:p>
     <w:p>
       <w:pPr>
-        <w:jc w:val="left"/>
-        <w:rPr>
-          <w:lang w:val="en-US"/>
-        </w:rPr>
-      </w:pPr>
-      <w:proofErr w:type="gramStart"/>
-      <w:r>
+        <w:rPr>
+          <w:lang w:val="en-US"/>
+        </w:rPr>
+      </w:pPr>
+      <w:proofErr w:type="gramStart"/>
+      <w:r>
+        <w:rPr>
+          <w:lang w:val="en-US"/>
+        </w:rPr>
         <w:t>{{</w:t>
       </w:r>
       <w:r>
+        <w:rPr>
+          <w:lang w:val="en-US"/>
+        </w:rPr>
         <w:t xml:space="preserve"> </w:t>
       </w:r>
-      <w:proofErr w:type="spellStart"/>
-      <w:r>
+      <w:r>
+        <w:rPr>
+          <w:lang w:val="en-US"/>
+        </w:rPr>
         <w:t>degree</w:t>
       </w:r>
       <w:proofErr w:type="gramEnd"/>
       <w:r>
+        <w:rPr>
+          <w:lang w:val="en-US"/>
+        </w:rPr>
         <w:t>_</w:t>
       </w:r>
       <w:proofErr w:type="gramStart"/>
       <w:r>
+        <w:rPr>
+          <w:lang w:val="en-US"/>
+        </w:rPr>
         <w:t>data.resume</w:t>
       </w:r>
       <w:proofErr w:type="gramEnd"/>
       <w:r>
+        <w:rPr>
+          <w:lang w:val="en-US"/>
+        </w:rPr>
         <w:t>_</w:t>
       </w:r>
       <w:proofErr w:type="gramStart"/>
       <w:r>
-        <w:t>conclusion</w:t>
-      </w:r>
-      <w:proofErr w:type="spellEnd"/>
-      <w:r>
-        <w:t xml:space="preserve"> }</w:t>
-      </w:r>
-      <w:proofErr w:type="gramEnd"/>
-      <w:r>
+        <w:rPr>
+          <w:lang w:val="en-US"/>
+        </w:rPr>
+        <w:t>conclusion }</w:t>
+      </w:r>
+      <w:proofErr w:type="gramEnd"/>
+      <w:r>
+        <w:rPr>
+          <w:lang w:val="en-US"/>
+        </w:rPr>
         <w:t>}</w:t>
       </w:r>
     </w:p>
@@ -2315,7 +2256,6 @@
           <w:ilvl w:val="0"/>
           <w:numId w:val="18"/>
         </w:numPr>
-        <w:jc w:val="left"/>
         <w:rPr>
           <w:lang w:val="en-US"/>
         </w:rPr>
@@ -6769,7 +6709,6 @@
     </w:p>
     <w:p>
       <w:pPr>
-        <w:jc w:val="left"/>
         <w:rPr>
           <w:lang w:val="en-US"/>
         </w:rPr>
@@ -6944,7 +6883,6 @@
           <w:ilvl w:val="0"/>
           <w:numId w:val="18"/>
         </w:numPr>
-        <w:jc w:val="left"/>
         <w:rPr>
           <w:lang w:val="en-US"/>
         </w:rPr>
@@ -10198,6 +10136,7 @@
   <w:style w:type="character" w:default="1" w:styleId="Fuentedeprrafopredeter">
     <w:name w:val="Default Paragraph Font"/>
     <w:uiPriority w:val="1"/>
+    <w:semiHidden/>
     <w:unhideWhenUsed/>
   </w:style>
   <w:style w:type="table" w:default="1" w:styleId="Tablanormal">

</xml_diff>